<commit_message>
update code and report
</commit_message>
<xml_diff>
--- a/Baocao/Week5/BaoCaoTuan5_PBL4.docx
+++ b/Baocao/Week5/BaoCaoTuan5_PBL4.docx
@@ -14046,8 +14046,13 @@
         </m:sSup>
       </m:oMath>
       <w:r>
-        <w:t xml:space="preserve"> = softmax(</w:t>
-      </w:r>
+        <w:t xml:space="preserve"> = </w:t>
+      </w:r>
+      <w:proofErr w:type="gramStart"/>
+      <w:r>
+        <w:t>softmax(</w:t>
+      </w:r>
+      <w:proofErr w:type="gramEnd"/>
       <m:oMath>
         <m:sSub>
           <m:sSubPr>
@@ -14077,8 +14082,13 @@
         </m:sSub>
       </m:oMath>
       <w:r>
-        <w:t xml:space="preserve"> · tanh(</w:t>
-      </w:r>
+        <w:t xml:space="preserve"> · </w:t>
+      </w:r>
+      <w:proofErr w:type="gramStart"/>
+      <w:r>
+        <w:t>tanh(</w:t>
+      </w:r>
+      <w:proofErr w:type="gramEnd"/>
       <m:oMath>
         <m:sSub>
           <m:sSubPr>
@@ -14737,8 +14747,18 @@
           <w:sz w:val="24"/>
           <w:szCs w:val="24"/>
         </w:rPr>
-        <w:t xml:space="preserve"> = softmax(</w:t>
-      </w:r>
+        <w:t xml:space="preserve"> = </w:t>
+      </w:r>
+      <w:proofErr w:type="gramStart"/>
+      <w:r>
+        <w:rPr>
+          <w:rFonts w:eastAsia="Courier New"/>
+          <w:sz w:val="24"/>
+          <w:szCs w:val="24"/>
+        </w:rPr>
+        <w:t>softmax(</w:t>
+      </w:r>
+      <w:proofErr w:type="gramEnd"/>
       <m:oMath>
         <m:sSub>
           <m:sSubPr>
@@ -14779,8 +14799,18 @@
           <w:sz w:val="24"/>
           <w:szCs w:val="24"/>
         </w:rPr>
-        <w:t xml:space="preserve"> · tanh(</w:t>
-      </w:r>
+        <w:t xml:space="preserve"> · </w:t>
+      </w:r>
+      <w:proofErr w:type="gramStart"/>
+      <w:r>
+        <w:rPr>
+          <w:rFonts w:eastAsia="Courier New"/>
+          <w:sz w:val="24"/>
+          <w:szCs w:val="24"/>
+        </w:rPr>
+        <w:t>tanh(</w:t>
+      </w:r>
+      <w:proofErr w:type="gramEnd"/>
       <m:oMath>
         <m:sSub>
           <m:sSubPr>
@@ -14958,8 +14988,18 @@
           <w:sz w:val="24"/>
           <w:szCs w:val="24"/>
         </w:rPr>
-        <w:t xml:space="preserve"> = Σ(</w:t>
-      </w:r>
+        <w:t xml:space="preserve"> = </w:t>
+      </w:r>
+      <w:proofErr w:type="gramStart"/>
+      <w:r>
+        <w:rPr>
+          <w:rFonts w:eastAsia="Courier New"/>
+          <w:sz w:val="24"/>
+          <w:szCs w:val="24"/>
+        </w:rPr>
+        <w:t>Σ(</w:t>
+      </w:r>
+      <w:proofErr w:type="gramEnd"/>
       <m:oMath>
         <m:sSubSup>
           <m:sSubSupPr>
@@ -17146,8 +17186,18 @@
           <w:sz w:val="24"/>
           <w:szCs w:val="24"/>
         </w:rPr>
-        <w:t xml:space="preserve"> Σ[</w:t>
-      </w:r>
+        <w:t xml:space="preserve"> </w:t>
+      </w:r>
+      <w:proofErr w:type="gramStart"/>
+      <w:r>
+        <w:rPr>
+          <w:rFonts w:eastAsia="Courier New"/>
+          <w:sz w:val="24"/>
+          <w:szCs w:val="24"/>
+        </w:rPr>
+        <w:t>Σ[</w:t>
+      </w:r>
+      <w:proofErr w:type="gramEnd"/>
       <m:oMath>
         <m:sSub>
           <m:sSubPr>
@@ -17622,7 +17672,15 @@
         </w:numPr>
       </w:pPr>
       <w:r>
-        <w:t>Max epochs: 60 (</w:t>
+        <w:t xml:space="preserve">Max </w:t>
+      </w:r>
+      <w:proofErr w:type="gramStart"/>
+      <w:r>
+        <w:t>epochs</w:t>
+      </w:r>
+      <w:proofErr w:type="gramEnd"/>
+      <w:r>
+        <w:t>: 60 (</w:t>
       </w:r>
       <w:proofErr w:type="spellStart"/>
       <w:r>
@@ -19884,7 +19942,15 @@
       </w:r>
       <w:proofErr w:type="spellEnd"/>
       <w:r>
-        <w:t xml:space="preserve"> weighted-average). Đạt 87.96% </w:t>
+        <w:t xml:space="preserve"> </w:t>
+      </w:r>
+      <w:proofErr w:type="gramStart"/>
+      <w:r>
+        <w:t>weighted-average</w:t>
+      </w:r>
+      <w:proofErr w:type="gramEnd"/>
+      <w:r>
+        <w:t xml:space="preserve">). Đạt 87.96% </w:t>
       </w:r>
       <w:proofErr w:type="spellStart"/>
       <w:r>
@@ -20814,699 +20880,10 @@
         <w:pStyle w:val="Heading2"/>
       </w:pPr>
       <w:r>
-        <w:t xml:space="preserve">1. </w:t>
-      </w:r>
-      <w:proofErr w:type="spellStart"/>
-      <w:r>
-        <w:t>Tuần</w:t>
-      </w:r>
-      <w:proofErr w:type="spellEnd"/>
-      <w:r>
-        <w:t xml:space="preserve"> 6 (03/02/2026 - 09/02/2026): Fine-tuning </w:t>
-      </w:r>
-      <w:proofErr w:type="spellStart"/>
-      <w:r>
-        <w:t>và</w:t>
-      </w:r>
-      <w:proofErr w:type="spellEnd"/>
-      <w:r>
-        <w:t xml:space="preserve"> </w:t>
-      </w:r>
-      <w:proofErr w:type="spellStart"/>
-      <w:r>
-        <w:t>đánh</w:t>
-      </w:r>
-      <w:proofErr w:type="spellEnd"/>
-      <w:r>
-        <w:t xml:space="preserve"> </w:t>
-      </w:r>
-      <w:proofErr w:type="spellStart"/>
-      <w:r>
-        <w:t>giá</w:t>
-      </w:r>
-      <w:proofErr w:type="spellEnd"/>
-    </w:p>
-    <w:p>
-      <w:pPr>
-        <w:spacing w:before="120" w:after="120"/>
-        <w:jc w:val="both"/>
-      </w:pPr>
-      <w:proofErr w:type="spellStart"/>
-      <w:r>
-        <w:t>Mục</w:t>
-      </w:r>
-      <w:proofErr w:type="spellEnd"/>
-      <w:r>
-        <w:t xml:space="preserve"> </w:t>
-      </w:r>
-      <w:proofErr w:type="spellStart"/>
-      <w:r>
-        <w:t>tiêu</w:t>
-      </w:r>
-      <w:proofErr w:type="spellEnd"/>
-      <w:r>
-        <w:t xml:space="preserve"> </w:t>
-      </w:r>
-      <w:proofErr w:type="spellStart"/>
-      <w:r>
-        <w:t>chính</w:t>
-      </w:r>
-      <w:proofErr w:type="spellEnd"/>
-      <w:r>
-        <w:t xml:space="preserve"> </w:t>
-      </w:r>
-      <w:proofErr w:type="spellStart"/>
-      <w:r>
-        <w:t>của</w:t>
-      </w:r>
-      <w:proofErr w:type="spellEnd"/>
-      <w:r>
-        <w:t xml:space="preserve"> </w:t>
-      </w:r>
-      <w:proofErr w:type="spellStart"/>
-      <w:r>
-        <w:t>tuần</w:t>
-      </w:r>
-      <w:proofErr w:type="spellEnd"/>
-      <w:r>
-        <w:t xml:space="preserve"> 6 </w:t>
-      </w:r>
-      <w:proofErr w:type="spellStart"/>
-      <w:r>
-        <w:t>là</w:t>
-      </w:r>
-      <w:proofErr w:type="spellEnd"/>
-      <w:r>
-        <w:t xml:space="preserve"> </w:t>
-      </w:r>
-      <w:proofErr w:type="spellStart"/>
-      <w:r>
-        <w:t>tinh</w:t>
-      </w:r>
-      <w:proofErr w:type="spellEnd"/>
-      <w:r>
-        <w:t xml:space="preserve"> </w:t>
-      </w:r>
-      <w:proofErr w:type="spellStart"/>
-      <w:r>
-        <w:t>chỉnh</w:t>
-      </w:r>
-      <w:proofErr w:type="spellEnd"/>
-      <w:r>
-        <w:t xml:space="preserve"> </w:t>
-      </w:r>
-      <w:proofErr w:type="spellStart"/>
-      <w:r>
-        <w:t>mô</w:t>
-      </w:r>
-      <w:proofErr w:type="spellEnd"/>
-      <w:r>
-        <w:t xml:space="preserve"> </w:t>
-      </w:r>
-      <w:proofErr w:type="spellStart"/>
-      <w:r>
-        <w:t>hình</w:t>
-      </w:r>
-      <w:proofErr w:type="spellEnd"/>
-      <w:r>
-        <w:t xml:space="preserve"> </w:t>
-      </w:r>
-      <w:proofErr w:type="spellStart"/>
-      <w:r>
-        <w:t>để</w:t>
-      </w:r>
-      <w:proofErr w:type="spellEnd"/>
-      <w:r>
-        <w:t xml:space="preserve"> </w:t>
-      </w:r>
-      <w:proofErr w:type="spellStart"/>
-      <w:r>
-        <w:t>đạt</w:t>
-      </w:r>
-      <w:proofErr w:type="spellEnd"/>
-      <w:r>
-        <w:t xml:space="preserve"> </w:t>
-      </w:r>
-      <w:proofErr w:type="spellStart"/>
-      <w:r>
-        <w:t>được</w:t>
-      </w:r>
-      <w:proofErr w:type="spellEnd"/>
-      <w:r>
-        <w:t xml:space="preserve"> </w:t>
-      </w:r>
-      <w:proofErr w:type="spellStart"/>
-      <w:r>
-        <w:t>hiệu</w:t>
-      </w:r>
-      <w:proofErr w:type="spellEnd"/>
-      <w:r>
-        <w:t xml:space="preserve"> </w:t>
-      </w:r>
-      <w:proofErr w:type="spellStart"/>
-      <w:r>
-        <w:t>suất</w:t>
-      </w:r>
-      <w:proofErr w:type="spellEnd"/>
-      <w:r>
-        <w:t xml:space="preserve"> </w:t>
-      </w:r>
-      <w:proofErr w:type="spellStart"/>
-      <w:r>
-        <w:t>tối</w:t>
-      </w:r>
-      <w:proofErr w:type="spellEnd"/>
-      <w:r>
-        <w:t xml:space="preserve"> </w:t>
-      </w:r>
-      <w:proofErr w:type="spellStart"/>
-      <w:r>
-        <w:t>ưu</w:t>
-      </w:r>
-      <w:proofErr w:type="spellEnd"/>
-      <w:r>
-        <w:t>:</w:t>
-      </w:r>
-    </w:p>
-    <w:p>
-      <w:pPr>
-        <w:pStyle w:val="ListParagraph"/>
-        <w:numPr>
-          <w:ilvl w:val="0"/>
-          <w:numId w:val="2"/>
-        </w:numPr>
-      </w:pPr>
-      <w:proofErr w:type="spellStart"/>
-      <w:r>
-        <w:t>Tiếp</w:t>
-      </w:r>
-      <w:proofErr w:type="spellEnd"/>
-      <w:r>
-        <w:t xml:space="preserve"> </w:t>
-      </w:r>
-      <w:proofErr w:type="spellStart"/>
-      <w:r>
-        <w:t>tục</w:t>
-      </w:r>
-      <w:proofErr w:type="spellEnd"/>
-      <w:r>
-        <w:t xml:space="preserve"> </w:t>
-      </w:r>
-      <w:proofErr w:type="spellStart"/>
-      <w:r>
-        <w:t>huấn</w:t>
-      </w:r>
-      <w:proofErr w:type="spellEnd"/>
-      <w:r>
-        <w:t xml:space="preserve"> </w:t>
-      </w:r>
-      <w:proofErr w:type="spellStart"/>
-      <w:r>
-        <w:t>luyện</w:t>
-      </w:r>
-      <w:proofErr w:type="spellEnd"/>
-      <w:r>
-        <w:t xml:space="preserve"> </w:t>
-      </w:r>
-      <w:proofErr w:type="spellStart"/>
-      <w:r>
-        <w:t>mô</w:t>
-      </w:r>
-      <w:proofErr w:type="spellEnd"/>
-      <w:r>
-        <w:t xml:space="preserve"> </w:t>
-      </w:r>
-      <w:proofErr w:type="spellStart"/>
-      <w:r>
-        <w:t>hình</w:t>
-      </w:r>
-      <w:proofErr w:type="spellEnd"/>
-      <w:r>
-        <w:t xml:space="preserve"> </w:t>
-      </w:r>
-      <w:proofErr w:type="spellStart"/>
-      <w:r>
-        <w:t>cho</w:t>
-      </w:r>
-      <w:proofErr w:type="spellEnd"/>
-      <w:r>
-        <w:t xml:space="preserve"> </w:t>
-      </w:r>
-      <w:proofErr w:type="spellStart"/>
-      <w:r>
-        <w:t>đến</w:t>
-      </w:r>
-      <w:proofErr w:type="spellEnd"/>
-      <w:r>
-        <w:t xml:space="preserve"> </w:t>
-      </w:r>
-      <w:proofErr w:type="spellStart"/>
-      <w:r>
-        <w:t>khi</w:t>
-      </w:r>
-      <w:proofErr w:type="spellEnd"/>
-      <w:r>
-        <w:t xml:space="preserve"> </w:t>
-      </w:r>
-      <w:proofErr w:type="spellStart"/>
-      <w:r>
-        <w:t>đạt</w:t>
-      </w:r>
-      <w:proofErr w:type="spellEnd"/>
-      <w:r>
-        <w:t xml:space="preserve"> early stopping </w:t>
-      </w:r>
-      <w:proofErr w:type="spellStart"/>
-      <w:r>
-        <w:t>hoặc</w:t>
-      </w:r>
-      <w:proofErr w:type="spellEnd"/>
-      <w:r>
-        <w:t xml:space="preserve"> </w:t>
-      </w:r>
-      <w:proofErr w:type="spellStart"/>
-      <w:r>
-        <w:t>hết</w:t>
-      </w:r>
-      <w:proofErr w:type="spellEnd"/>
-      <w:r>
-        <w:t xml:space="preserve"> 60 epochs.</w:t>
-      </w:r>
-    </w:p>
-    <w:p>
-      <w:pPr>
-        <w:pStyle w:val="ListParagraph"/>
-        <w:numPr>
-          <w:ilvl w:val="0"/>
-          <w:numId w:val="2"/>
-        </w:numPr>
-      </w:pPr>
-      <w:proofErr w:type="spellStart"/>
-      <w:r>
-        <w:t>Thử</w:t>
-      </w:r>
-      <w:proofErr w:type="spellEnd"/>
-      <w:r>
-        <w:t xml:space="preserve"> </w:t>
-      </w:r>
-      <w:proofErr w:type="spellStart"/>
-      <w:r>
-        <w:t>nghiệm</w:t>
-      </w:r>
-      <w:proofErr w:type="spellEnd"/>
-      <w:r>
-        <w:t xml:space="preserve"> </w:t>
-      </w:r>
-      <w:proofErr w:type="spellStart"/>
-      <w:r>
-        <w:t>các</w:t>
-      </w:r>
-      <w:proofErr w:type="spellEnd"/>
-      <w:r>
-        <w:t xml:space="preserve"> </w:t>
-      </w:r>
-      <w:proofErr w:type="spellStart"/>
-      <w:r>
-        <w:t>chiến</w:t>
-      </w:r>
-      <w:proofErr w:type="spellEnd"/>
-      <w:r>
-        <w:t xml:space="preserve"> </w:t>
-      </w:r>
-      <w:proofErr w:type="spellStart"/>
-      <w:r>
-        <w:t>lược</w:t>
-      </w:r>
-      <w:proofErr w:type="spellEnd"/>
-      <w:r>
-        <w:t xml:space="preserve"> </w:t>
-      </w:r>
-      <w:proofErr w:type="spellStart"/>
-      <w:r>
-        <w:t>điều</w:t>
-      </w:r>
-      <w:proofErr w:type="spellEnd"/>
-      <w:r>
-        <w:t xml:space="preserve"> </w:t>
-      </w:r>
-      <w:proofErr w:type="spellStart"/>
-      <w:r>
-        <w:t>chỉnh</w:t>
-      </w:r>
-      <w:proofErr w:type="spellEnd"/>
-      <w:r>
-        <w:t xml:space="preserve"> learning rate </w:t>
-      </w:r>
-      <w:proofErr w:type="spellStart"/>
-      <w:r>
-        <w:t>để</w:t>
-      </w:r>
-      <w:proofErr w:type="spellEnd"/>
-      <w:r>
-        <w:t xml:space="preserve"> </w:t>
-      </w:r>
-      <w:proofErr w:type="spellStart"/>
-      <w:r>
-        <w:t>cải</w:t>
-      </w:r>
-      <w:proofErr w:type="spellEnd"/>
-      <w:r>
-        <w:t xml:space="preserve"> </w:t>
-      </w:r>
-      <w:proofErr w:type="spellStart"/>
-      <w:r>
-        <w:t>thiện</w:t>
-      </w:r>
-      <w:proofErr w:type="spellEnd"/>
-      <w:r>
-        <w:t xml:space="preserve"> </w:t>
-      </w:r>
-      <w:proofErr w:type="spellStart"/>
-      <w:r>
-        <w:t>hội</w:t>
-      </w:r>
-      <w:proofErr w:type="spellEnd"/>
-      <w:r>
-        <w:t xml:space="preserve"> </w:t>
-      </w:r>
-      <w:proofErr w:type="spellStart"/>
-      <w:r>
-        <w:t>tụ</w:t>
-      </w:r>
-      <w:proofErr w:type="spellEnd"/>
-      <w:r>
-        <w:t>.</w:t>
-      </w:r>
-    </w:p>
-    <w:p>
-      <w:pPr>
-        <w:pStyle w:val="ListParagraph"/>
-        <w:numPr>
-          <w:ilvl w:val="0"/>
-          <w:numId w:val="2"/>
-        </w:numPr>
-      </w:pPr>
-      <w:proofErr w:type="spellStart"/>
-      <w:r>
-        <w:t>Điều</w:t>
-      </w:r>
-      <w:proofErr w:type="spellEnd"/>
-      <w:r>
-        <w:t xml:space="preserve"> </w:t>
-      </w:r>
-      <w:proofErr w:type="spellStart"/>
-      <w:r>
-        <w:t>chỉnh</w:t>
-      </w:r>
-      <w:proofErr w:type="spellEnd"/>
-      <w:r>
-        <w:t xml:space="preserve"> </w:t>
-      </w:r>
-      <w:proofErr w:type="spellStart"/>
-      <w:r>
-        <w:t>các</w:t>
-      </w:r>
-      <w:proofErr w:type="spellEnd"/>
-      <w:r>
-        <w:t xml:space="preserve"> hyperparameters (dropout rate, L2 regularization) </w:t>
-      </w:r>
-      <w:proofErr w:type="spellStart"/>
-      <w:r>
-        <w:t>để</w:t>
-      </w:r>
-      <w:proofErr w:type="spellEnd"/>
-      <w:r>
-        <w:t xml:space="preserve"> </w:t>
-      </w:r>
-      <w:proofErr w:type="spellStart"/>
-      <w:r>
-        <w:t>giảm</w:t>
-      </w:r>
-      <w:proofErr w:type="spellEnd"/>
-      <w:r>
-        <w:t xml:space="preserve"> overfitting.</w:t>
-      </w:r>
-    </w:p>
-    <w:p>
-      <w:pPr>
-        <w:pStyle w:val="ListParagraph"/>
-        <w:numPr>
-          <w:ilvl w:val="0"/>
-          <w:numId w:val="2"/>
-        </w:numPr>
-      </w:pPr>
-      <w:proofErr w:type="spellStart"/>
-      <w:r>
-        <w:t>Đánh</w:t>
-      </w:r>
-      <w:proofErr w:type="spellEnd"/>
-      <w:r>
-        <w:t xml:space="preserve"> </w:t>
-      </w:r>
-      <w:proofErr w:type="spellStart"/>
-      <w:r>
-        <w:t>giá</w:t>
-      </w:r>
-      <w:proofErr w:type="spellEnd"/>
-      <w:r>
-        <w:t xml:space="preserve"> chi </w:t>
-      </w:r>
-      <w:proofErr w:type="spellStart"/>
-      <w:r>
-        <w:t>tiết</w:t>
-      </w:r>
-      <w:proofErr w:type="spellEnd"/>
-      <w:r>
-        <w:t xml:space="preserve"> </w:t>
-      </w:r>
-      <w:proofErr w:type="spellStart"/>
-      <w:r>
-        <w:t>hiệu</w:t>
-      </w:r>
-      <w:proofErr w:type="spellEnd"/>
-      <w:r>
-        <w:t xml:space="preserve"> </w:t>
-      </w:r>
-      <w:proofErr w:type="spellStart"/>
-      <w:r>
-        <w:t>suất</w:t>
-      </w:r>
-      <w:proofErr w:type="spellEnd"/>
-      <w:r>
-        <w:t xml:space="preserve"> </w:t>
-      </w:r>
-      <w:proofErr w:type="spellStart"/>
-      <w:r>
-        <w:t>trên</w:t>
-      </w:r>
-      <w:proofErr w:type="spellEnd"/>
-      <w:r>
-        <w:t xml:space="preserve"> </w:t>
-      </w:r>
-      <w:proofErr w:type="spellStart"/>
-      <w:r>
-        <w:t>tập</w:t>
-      </w:r>
-      <w:proofErr w:type="spellEnd"/>
-      <w:r>
-        <w:t xml:space="preserve"> test (fold 10) </w:t>
-      </w:r>
-      <w:proofErr w:type="spellStart"/>
-      <w:r>
-        <w:t>theo</w:t>
-      </w:r>
-      <w:proofErr w:type="spellEnd"/>
-      <w:r>
-        <w:t xml:space="preserve"> </w:t>
-      </w:r>
-      <w:proofErr w:type="spellStart"/>
-      <w:r>
-        <w:t>các</w:t>
-      </w:r>
-      <w:proofErr w:type="spellEnd"/>
-      <w:r>
-        <w:t xml:space="preserve"> metrics: Accuracy, ROC-AUC, F1-score.</w:t>
-      </w:r>
-    </w:p>
-    <w:p>
-      <w:pPr>
-        <w:pStyle w:val="ListParagraph"/>
-        <w:numPr>
-          <w:ilvl w:val="0"/>
-          <w:numId w:val="2"/>
-        </w:numPr>
-      </w:pPr>
-      <w:r>
-        <w:t xml:space="preserve">So </w:t>
-      </w:r>
-      <w:proofErr w:type="spellStart"/>
-      <w:r>
-        <w:t>sánh</w:t>
-      </w:r>
-      <w:proofErr w:type="spellEnd"/>
-      <w:r>
-        <w:t xml:space="preserve"> </w:t>
-      </w:r>
-      <w:proofErr w:type="spellStart"/>
-      <w:r>
-        <w:t>kết</w:t>
-      </w:r>
-      <w:proofErr w:type="spellEnd"/>
-      <w:r>
-        <w:t xml:space="preserve"> </w:t>
-      </w:r>
-      <w:proofErr w:type="spellStart"/>
-      <w:r>
-        <w:t>quả</w:t>
-      </w:r>
-      <w:proofErr w:type="spellEnd"/>
-      <w:r>
-        <w:t xml:space="preserve"> </w:t>
-      </w:r>
-      <w:proofErr w:type="spellStart"/>
-      <w:r>
-        <w:t>với</w:t>
-      </w:r>
-      <w:proofErr w:type="spellEnd"/>
-      <w:r>
-        <w:t xml:space="preserve"> </w:t>
-      </w:r>
-      <w:proofErr w:type="spellStart"/>
-      <w:r>
-        <w:t>các</w:t>
-      </w:r>
-      <w:proofErr w:type="spellEnd"/>
-      <w:r>
-        <w:t xml:space="preserve"> </w:t>
-      </w:r>
-      <w:proofErr w:type="spellStart"/>
-      <w:r>
-        <w:t>mô</w:t>
-      </w:r>
-      <w:proofErr w:type="spellEnd"/>
-      <w:r>
-        <w:t xml:space="preserve"> </w:t>
-      </w:r>
-      <w:proofErr w:type="spellStart"/>
-      <w:r>
-        <w:t>hình</w:t>
-      </w:r>
-      <w:proofErr w:type="spellEnd"/>
-      <w:r>
-        <w:t xml:space="preserve"> baseline (ResNet101, </w:t>
-      </w:r>
-      <w:proofErr w:type="spellStart"/>
-      <w:r>
-        <w:t>ECGNet</w:t>
-      </w:r>
-      <w:proofErr w:type="spellEnd"/>
-      <w:r>
-        <w:t xml:space="preserve">, </w:t>
-      </w:r>
-      <w:proofErr w:type="spellStart"/>
-      <w:r>
-        <w:t>Rajpurkar</w:t>
-      </w:r>
-      <w:proofErr w:type="spellEnd"/>
-      <w:r>
-        <w:t xml:space="preserve"> et al.).</w:t>
-      </w:r>
-    </w:p>
-    <w:p>
-      <w:pPr>
-        <w:pStyle w:val="ListParagraph"/>
-        <w:numPr>
-          <w:ilvl w:val="0"/>
-          <w:numId w:val="2"/>
-        </w:numPr>
-      </w:pPr>
-      <w:proofErr w:type="spellStart"/>
-      <w:r>
-        <w:t>Phân</w:t>
-      </w:r>
-      <w:proofErr w:type="spellEnd"/>
-      <w:r>
-        <w:t xml:space="preserve"> </w:t>
-      </w:r>
-      <w:proofErr w:type="spellStart"/>
-      <w:r>
-        <w:t>tích</w:t>
-      </w:r>
-      <w:proofErr w:type="spellEnd"/>
-      <w:r>
-        <w:t xml:space="preserve"> chi </w:t>
-      </w:r>
-      <w:proofErr w:type="spellStart"/>
-      <w:r>
-        <w:t>tiết</w:t>
-      </w:r>
-      <w:proofErr w:type="spellEnd"/>
-      <w:r>
-        <w:t xml:space="preserve"> </w:t>
-      </w:r>
-      <w:proofErr w:type="spellStart"/>
-      <w:r>
-        <w:t>kết</w:t>
-      </w:r>
-      <w:proofErr w:type="spellEnd"/>
-      <w:r>
-        <w:t xml:space="preserve"> </w:t>
-      </w:r>
-      <w:proofErr w:type="spellStart"/>
-      <w:r>
-        <w:t>quả</w:t>
-      </w:r>
-      <w:proofErr w:type="spellEnd"/>
-      <w:r>
-        <w:t xml:space="preserve"> </w:t>
-      </w:r>
-      <w:proofErr w:type="spellStart"/>
-      <w:r>
-        <w:t>theo</w:t>
-      </w:r>
-      <w:proofErr w:type="spellEnd"/>
-      <w:r>
-        <w:t xml:space="preserve"> </w:t>
-      </w:r>
-      <w:proofErr w:type="spellStart"/>
-      <w:r>
-        <w:t>từng</w:t>
-      </w:r>
-      <w:proofErr w:type="spellEnd"/>
-      <w:r>
-        <w:t xml:space="preserve"> </w:t>
-      </w:r>
-      <w:proofErr w:type="spellStart"/>
-      <w:r>
-        <w:t>lớp</w:t>
-      </w:r>
-      <w:proofErr w:type="spellEnd"/>
-      <w:r>
-        <w:t xml:space="preserve"> </w:t>
-      </w:r>
-      <w:proofErr w:type="spellStart"/>
-      <w:r>
-        <w:t>bệnh</w:t>
-      </w:r>
-      <w:proofErr w:type="spellEnd"/>
-      <w:r>
-        <w:t xml:space="preserve"> </w:t>
-      </w:r>
-      <w:proofErr w:type="spellStart"/>
-      <w:r>
-        <w:t>lý</w:t>
-      </w:r>
-      <w:proofErr w:type="spellEnd"/>
-      <w:r>
-        <w:t xml:space="preserve"> (NORM, CD, MI, HYP, STTC).</w:t>
-      </w:r>
-    </w:p>
-    <w:p>
-      <w:pPr>
-        <w:pStyle w:val="Heading2"/>
-      </w:pPr>
-      <w:r>
-        <w:t xml:space="preserve">2. </w:t>
+        <w:t>1</w:t>
+      </w:r>
+      <w:r>
+        <w:t xml:space="preserve">. </w:t>
       </w:r>
       <w:proofErr w:type="spellStart"/>
       <w:r>

</xml_diff>